<commit_message>
Amplía proyectos, municipios, archivos y seguridad
- Añade búsquedas y filtros territoriales para proyectos multimunicipales.
- Mejora consultas espaciales, relaciones municipales y selección geográfica.
- Incorpora seguridad Windows/Active Directory y permisos de eliminación.
- Refuerza auditoría con `SAVEPOINT` y amplía la cobertura de pruebas.
- Mejora gestión, filtrado, ordenación y navegación de archivos.
- Conserva capas del usuario y optimiza cargas geográficas y metadatos ISO.
- Actualiza vistas, documentación, recursos y reglas de `.gitignore`.
- Traslada las credenciales de `appsettings.json` a secretos seguros y revoca las expuestas.
</commit_message>
<xml_diff>
--- a/Documentos/Documento Final/Documento de Grado Marbin.docx
+++ b/Documentos/Documento Final/Documento de Grado Marbin.docx
@@ -212,7 +212,7 @@
     </w:p>
     <w:p>
       <w:r>
-        <w:t xml:space="preserve">Le dedico este trabajo a todos aquellos que han estado en mi camino de formación, amigos, profesores, familiares, tales como Willington Ortiz quién me ayudó a pasar por los días más oscuros de mi vida sin esperar nada a cambio, </w:t>
+        <w:t>Le dedico este trabajo a todos aquellos que han estado en mi camino de formación, amigos, profesores y familiares, tales como Willington Ortiz, quien me ayudó a pasar por los días más oscuros de mi vida sin esperar nada a cambio.</w:t>
       </w:r>
     </w:p>
     <w:p>
@@ -3485,7 +3485,7 @@
             <w:rStyle w:val="Hipervnculo"/>
             <w:noProof/>
           </w:rPr>
-          <w:t>4. Recomendaciones (Opcional)</w:t>
+          <w:t>Recomendaciones</w:t>
         </w:r>
         <w:r>
           <w:rPr>
@@ -3864,7 +3864,7 @@
             <w:b/>
             <w:noProof/>
           </w:rPr>
-          <w:t>Tabla 1</w:t>
+          <w:t>Tabla 2</w:t>
         </w:r>
         <w:r>
           <w:rPr>
@@ -3948,7 +3948,7 @@
             <w:b/>
             <w:noProof/>
           </w:rPr>
-          <w:t>Tabla 1</w:t>
+          <w:t>Tabla 3</w:t>
         </w:r>
         <w:r>
           <w:rPr>
@@ -4032,7 +4032,7 @@
             <w:b/>
             <w:noProof/>
           </w:rPr>
-          <w:t>Tabla 1</w:t>
+          <w:t>Tabla 4</w:t>
         </w:r>
         <w:r>
           <w:rPr>
@@ -4132,7 +4132,7 @@
             <w:b/>
             <w:noProof/>
           </w:rPr>
-          <w:t>Tabla 1</w:t>
+          <w:t>Tabla 5</w:t>
         </w:r>
         <w:r>
           <w:rPr>
@@ -4216,7 +4216,7 @@
             <w:b/>
             <w:noProof/>
           </w:rPr>
-          <w:t>Tabla 1</w:t>
+          <w:t>Tabla 6</w:t>
         </w:r>
         <w:r>
           <w:rPr>
@@ -4488,34 +4488,7 @@
         <w:ind w:firstLine="0"/>
       </w:pPr>
       <w:r>
-        <w:t xml:space="preserve">(Se indican de dos formas: Si son menos de 27 </w:t>
-      </w:r>
-      <w:r>
-        <w:t>apéndices</w:t>
-      </w:r>
-      <w:r>
-        <w:t xml:space="preserve">, se listan con las letras del alfabeto, </w:t>
-      </w:r>
-      <w:r>
-        <w:t xml:space="preserve">si son mayores de 27 </w:t>
-      </w:r>
-      <w:r>
-        <w:t>apéndices</w:t>
-      </w:r>
-      <w:r>
-        <w:t xml:space="preserve">, se listan con </w:t>
-      </w:r>
-      <w:r>
-        <w:t>números</w:t>
-      </w:r>
-      <w:r>
-        <w:t xml:space="preserve">. Al igual que las anteriores listas, </w:t>
-      </w:r>
-      <w:r>
-        <w:t>también</w:t>
-      </w:r>
-      <w:r>
-        <w:t xml:space="preserve"> llevan el titulo completo)</w:t>
+        <w:t>Apéndice A. Script de definición de datos del esquema espacial (ddl_geovisor_schema.sql).</w:t>
       </w:r>
     </w:p>
     <w:p>
@@ -4528,57 +4501,7 @@
         <w:ind w:firstLine="0"/>
       </w:pPr>
       <w:r>
-        <w:rPr>
-          <w:u w:val="single"/>
-        </w:rPr>
-        <w:t>Nota</w:t>
-      </w:r>
-      <w:r>
-        <w:t xml:space="preserve">: Si los apéndices van dentro del cuerpo o contenido del trabajo de grado listados al final del mismo, se debe indicar el </w:t>
-      </w:r>
-      <w:r>
-        <w:t>número</w:t>
-      </w:r>
-      <w:r>
-        <w:t xml:space="preserve"> de la </w:t>
-      </w:r>
-      <w:r>
-        <w:t>página</w:t>
-      </w:r>
-      <w:r>
-        <w:t>, si desea a</w:t>
-      </w:r>
-      <w:r>
-        <w:t xml:space="preserve">gruparlos en una carpeta adjunta </w:t>
-      </w:r>
-      <w:r>
-        <w:t xml:space="preserve">no debe colocar </w:t>
-      </w:r>
-      <w:r>
-        <w:t>número</w:t>
-      </w:r>
-      <w:r>
-        <w:t xml:space="preserve"> de </w:t>
-      </w:r>
-      <w:r>
-        <w:t>página</w:t>
-      </w:r>
-      <w:r>
-        <w:t>, en reemplazo, debe colocar un mensaje que indique:</w:t>
-      </w:r>
-    </w:p>
-    <w:p>
-      <w:pPr>
-        <w:ind w:firstLine="0"/>
-      </w:pPr>
-      <w:r>
-        <w:t xml:space="preserve">“Los apéndices están adjuntos y puede visualizarlos en </w:t>
-      </w:r>
-      <w:r>
-        <w:t xml:space="preserve">la </w:t>
-      </w:r>
-      <w:r>
-        <w:t>base de datos de la biblioteca UIS”</w:t>
+        <w:t>Apéndice B. Síntesis de resultados del instrumento de validación operativa con usuarios del grupo GEOMÁTICA.</w:t>
       </w:r>
     </w:p>
     <w:p/>
@@ -5129,36 +5052,13 @@
       <w:r>
         <w:rPr>
           <w:b/>
-          <w:bCs/>
-          <w:szCs w:val="24"/>
         </w:rPr>
         <w:t xml:space="preserve">Descripción: </w:t>
       </w:r>
       <w:r>
-        <w:rPr>
-          <w:bCs/>
-          <w:szCs w:val="24"/>
-        </w:rPr>
-        <w:t>Debe contener mínimo doscientas, máximo trescientas palabras. Aquí en la descripción se puede disminuir el tamaño de la letra y/o el interlineado, con el fin de que no exceda una hoja.</w:t>
-      </w:r>
-    </w:p>
-    <w:p>
-      <w:pPr>
-        <w:ind w:firstLine="0"/>
-      </w:pPr>
-    </w:p>
-    <w:p>
-      <w:pPr>
-        <w:ind w:firstLine="0"/>
-        <w:jc w:val="center"/>
-      </w:pPr>
-    </w:p>
-    <w:p>
-      <w:pPr>
-        <w:ind w:firstLine="0"/>
-      </w:pPr>
-    </w:p>
-    <w:p/>
+        <w:t>El Grupo de Investigación GEOMÁTICA, adscrito a la Escuela de Ingeniería Civil de la Universidad Industrial de Santander (UIS), ha generado a lo largo de su trayectoria un volumen significativo de productos geoespaciales de alta densidad —tales como nubes de puntos LiDAR, ortomosaicos, modelos digitales de elevación, planimetrías CAD y geodatabases vectoriales— que carecían de un mecanismo centralizado para su catalogación, localización geográfica y consulta estructurada. Para resolver esta problemática, se desarrolló Geomatica.Desktop, un sistema de información geográfica de escritorio construido en C# sobre .NET 8 bajo los principios de Clean Architecture y el patrón de presentación Model-View-ViewModel (MVVM) en Windows Presentation Foundation (WPF). La persistencia de datos se implementó en PostgreSQL 16 con la extensión espacial PostGIS 3.4 empleando el marco de referencia oficial MAGNA-SIRGAS (EPSG:4686), índices espaciales GiST, índices de trigramas GIN, validación territorial sobre la cartografía DIVIPOLA y un registro transaccional inmutable de auditoría. El componente cartográfico integra ArcGIS Maps SDK for .NET con soporte de cartografía base sin conexión (VTPK), filtros espaciotemporales multicriterio y herramientas de medición bidimensional y tridimensional. Adicionalmente, se implementó un explorador virtual de archivos con control de permisos sobre el dominio UIS, empaquetado ZIP en segundo plano, extracción automática de metadatos bajo un perfil adaptado de la norma ISO 19115-1:2014 y previsualización nativa de formatos especializados mediante GDAL, ACadSharp y procesadores asíncronos. La estabilidad técnica y operativa de la herramienta se verificó mediante una batería de 194 pruebas unitarias automatizadas en xUnit y pruebas operativas con investigadores del grupo, consolidando un repositorio institucional trazable y de alto desempeño.</w:t>
+      </w:r>
+    </w:p>
     <w:p/>
     <w:p>
       <w:pPr>
@@ -5346,54 +5246,14 @@
       </w:pPr>
       <w:r>
         <w:rPr>
-          <w:rFonts w:cs="Arial"/>
           <w:b/>
-          <w:bCs/>
-          <w:szCs w:val="24"/>
-        </w:rPr>
-        <w:t>Description:</w:t>
-      </w:r>
-      <w:r>
-        <w:rPr>
-          <w:rFonts w:cs="Arial"/>
-          <w:szCs w:val="24"/>
-        </w:rPr>
-        <w:t xml:space="preserve"> (Debe tener en cuenta las recomendaciones estipuladas por la biblioteca para presentar el resumen, este resumen en ingles también va </w:t>
-      </w:r>
-      <w:r>
-        <w:rPr>
-          <w:rFonts w:cs="Arial"/>
-          <w:szCs w:val="24"/>
-        </w:rPr>
-        <w:t>en un</w:t>
-      </w:r>
-      <w:r>
-        <w:rPr>
-          <w:rFonts w:cs="Arial"/>
-          <w:szCs w:val="24"/>
-        </w:rPr>
-        <w:t xml:space="preserve"> archivo llamado Resumen inglés. </w:t>
-      </w:r>
-      <w:r>
-        <w:rPr>
-          <w:rFonts w:cs="Arial"/>
-          <w:szCs w:val="24"/>
-        </w:rPr>
-        <w:t>Debe adecuarlo para que quede en una hoja. NO olvidar todo el resumen va traducido al inglés, incluyendo el pie de página.</w:t>
-      </w:r>
-    </w:p>
-    <w:p>
-      <w:pPr>
-        <w:ind w:firstLine="0"/>
-      </w:pPr>
-    </w:p>
-    <w:p>
-      <w:pPr>
-        <w:jc w:val="center"/>
-      </w:pPr>
-    </w:p>
-    <w:p/>
-    <w:p/>
+        </w:rPr>
+        <w:t xml:space="preserve">Description: </w:t>
+      </w:r>
+      <w:r>
+        <w:t>The GEOMÁTICA Research Group, attached to the School of Civil Engineering at the Industrial University of Santander (UIS), has produced a substantial volume of high-density geospatial datasets—including LiDAR point clouds, orthomosaics, digital elevation models, CAD drawings, and vector geodatabases—that previously lacked a centralized system for cataloging, spatial localization, and structured retrieval. To address this challenge, this project developed Geomatica.Desktop, a desktop geographic information system built in C# on .NET 8 following Clean Architecture principles and the Model-View-ViewModel (MVVM) pattern in Windows Presentation Foundation (WPF). Data persistence was implemented on PostgreSQL 16 with the PostGIS 3.4 spatial extension using the official Colombian reference frame MAGNA-SIRGAS (EPSG:4686), GiST spatial indexes, GIN trigram indexes, territorial validation against DIVIPOLA boundaries, and an immutable transactional audit log. The cartographic module integrates ArcGIS Maps SDK for .NET with offline vector tile basemap support (VTPK), multi-criteria spatiotemporal filtering, and 2D/3D measurement tools. Furthermore, the system incorporates a virtual file explorer integrated with UIS domain access permissions, background ZIP packaging, automated metadata extraction aligned with a tailored ISO 19115-1:2014 profile, and native preview capabilities for specialized formats powered by GDAL, ACadSharp, and asynchronous workers. System reliability and usability were validated through an automated suite of 194 unit tests in xUnit alongside operational trials with researchers from the group, delivering a traceable and high-performance institutional repository.</w:t>
+      </w:r>
+    </w:p>
     <w:p/>
     <w:p>
       <w:pPr>
@@ -5750,44 +5610,10 @@
         <w:rPr>
           <w:b/>
         </w:rPr>
-        <w:t>Las metodologías ágiles</w:t>
-      </w:r>
-      <w:r>
-        <w:rPr>
-          <w:b/>
-        </w:rPr>
-        <w:t xml:space="preserve">, </w:t>
-      </w:r>
-      <w:r>
-        <w:t xml:space="preserve">en específico la metodología Scrum, </w:t>
-      </w:r>
-      <w:r>
-        <w:t>proporciona el marco de gestión que permite implementar el sistema de manera eficiente y adaptativa.</w:t>
-      </w:r>
-      <w:r>
-        <w:t xml:space="preserve"> Este enfoque metodológico permite ser adaptado para proyectos SIG y su utilidad es bastante notoria ya que, como dicen Arias y Becerra </w:t>
-      </w:r>
-      <w:r>
-        <w:fldChar w:fldCharType="begin"/>
-      </w:r>
-      <w:r>
-        <w:instrText xml:space="preserve"> REF _Ref199175818 \r \h </w:instrText>
-      </w:r>
-      <w:r>
-        <w:fldChar w:fldCharType="separate"/>
-      </w:r>
-      <w:r>
-        <w:rPr>
-          <w:b/>
-          <w:lang w:val="es-ES"/>
-        </w:rPr>
-        <w:t>¡Error! No se encuentra el origen de la referencia.</w:t>
-      </w:r>
-      <w:r>
-        <w:fldChar w:fldCharType="end"/>
-      </w:r>
-      <w:r>
-        <w:t>, “Uno de los problemas más recurrentes durante el desarrollo del SIG, es la insatisfacción del usuario final, debido a que los usuarios finales no interactúan con el desarrollo hasta que el proceso finaliza”.</w:t>
+        <w:t xml:space="preserve">Las metodologías ágiles, </w:t>
+      </w:r>
+      <w:r>
+        <w:t>en específico la metodología Scrum, proporcionan el marco de gestión que permite implementar el sistema de manera eficiente y adaptativa. Este enfoque metodológico permite ser adaptado para proyectos SIG y su utilidad es bastante notoria ya que, como señalan Arias y Becerra (2018), “Uno de los problemas más recurrentes durante el desarrollo del SIG, es la insatisfacción del usuario final, debido a que los usuarios finales no interactúan con el desarrollo hasta que el proceso finaliza”.</w:t>
       </w:r>
     </w:p>
     <w:p>
@@ -5839,54 +5665,6 @@
       <w:r>
         <w:t>. Este campo trasciende la mera recolección de datos, articulando un ecosistema tecnológico que incluye desde sensores avanzados hasta modelos predictivos basados en inteligencia artificial.</w:t>
       </w:r>
-    </w:p>
-    <w:p>
-      <w:r>
-        <w:t xml:space="preserve">Debe ser </w:t>
-      </w:r>
-      <w:r>
-        <w:t>clara la</w:t>
-      </w:r>
-      <w:r>
-        <w:t xml:space="preserve"> manera en que se </w:t>
-      </w:r>
-      <w:r>
-        <w:t>efectuó</w:t>
-      </w:r>
-      <w:r>
-        <w:t xml:space="preserve"> el estudio, responde a la pregunta: ¿Cómo se va a realizar investigación/proyecto? Son las acciones y los procedimientos </w:t>
-      </w:r>
-      <w:r>
-        <w:t>necesarios para</w:t>
-      </w:r>
-      <w:r>
-        <w:t xml:space="preserve"> alcanzar las metas y objetivos propuestos. El </w:t>
-      </w:r>
-      <w:r>
-        <w:t>método</w:t>
-      </w:r>
-      <w:r>
-        <w:t xml:space="preserve"> es el </w:t>
-      </w:r>
-      <w:r>
-        <w:t>camino que</w:t>
-      </w:r>
-      <w:r>
-        <w:t xml:space="preserve"> se </w:t>
-      </w:r>
-      <w:r>
-        <w:t>elige</w:t>
-      </w:r>
-      <w:r>
-        <w:t xml:space="preserve"> para la obtención de un fin, la metodología implica la definición de tareas, normas y </w:t>
-      </w:r>
-      <w:r>
-        <w:t>procedimientos para</w:t>
-      </w:r>
-      <w:r>
-        <w:t xml:space="preserve"> la ejecución).</w:t>
-      </w:r>
-      <w:bookmarkEnd w:id="13"/>
     </w:p>
     <w:p>
       <w:r>
@@ -6028,50 +5806,12 @@
       </w:pPr>
       <w:r>
         <w:rPr>
-          <w:bdr w:val="none" w:sz="0" w:space="0" w:color="auto" w:frame="1"/>
+          <w:b/>
         </w:rPr>
         <w:t xml:space="preserve">PostgreSQL/PostGIS: </w:t>
       </w:r>
       <w:r>
-        <w:rPr>
-          <w:bdr w:val="none" w:sz="0" w:space="0" w:color="auto" w:frame="1"/>
-        </w:rPr>
-        <w:t xml:space="preserve">Soporta operaciones espaciales nativas, permitiendo ejecutar consultas que combinan atributos alfanuméricos con criterios de ubicación geométrica. </w:t>
-      </w:r>
-      <w:r>
-        <w:rPr>
-          <w:bdr w:val="none" w:sz="0" w:space="0" w:color="auto" w:frame="1"/>
-        </w:rPr>
-        <w:fldChar w:fldCharType="begin"/>
-      </w:r>
-      <w:r>
-        <w:rPr>
-          <w:bdr w:val="none" w:sz="0" w:space="0" w:color="auto" w:frame="1"/>
-        </w:rPr>
-        <w:instrText xml:space="preserve"> REF _Ref197015278 \r \h  \* MERGEFORMAT </w:instrText>
-      </w:r>
-      <w:r>
-        <w:rPr>
-          <w:bdr w:val="none" w:sz="0" w:space="0" w:color="auto" w:frame="1"/>
-        </w:rPr>
-      </w:r>
-      <w:r>
-        <w:rPr>
-          <w:bdr w:val="none" w:sz="0" w:space="0" w:color="auto" w:frame="1"/>
-        </w:rPr>
-        <w:fldChar w:fldCharType="separate"/>
-      </w:r>
-      <w:r>
-        <w:rPr>
-          <w:bdr w:val="none" w:sz="0" w:space="0" w:color="auto" w:frame="1"/>
-        </w:rPr>
-        <w:t>[5]</w:t>
-      </w:r>
-      <w:r>
-        <w:rPr>
-          <w:bdr w:val="none" w:sz="0" w:space="0" w:color="auto" w:frame="1"/>
-        </w:rPr>
-        <w:fldChar w:fldCharType="end"/>
+        <w:t>Soporta operaciones espaciales nativas, permitiendo ejecutar consultas que combinan atributos alfanuméricos con criterios de ubicación geométrica (PostGIS Project Steering Committee, s. f.-a; Obe y Hsu, 2021).</w:t>
       </w:r>
     </w:p>
     <w:p>
@@ -6087,44 +5827,12 @@
       </w:pPr>
       <w:r>
         <w:rPr>
-          <w:bdr w:val="none" w:sz="0" w:space="0" w:color="auto" w:frame="1"/>
-        </w:rPr>
-        <w:t xml:space="preserve">Índices GiST/R-tree: Estructuras de indexación espacial integradas en el motor de base de datos que optimizan los tiempos de respuesta en las búsquedas por ubicación. </w:t>
-      </w:r>
-      <w:r>
-        <w:rPr>
-          <w:bdr w:val="none" w:sz="0" w:space="0" w:color="auto" w:frame="1"/>
-        </w:rPr>
-        <w:fldChar w:fldCharType="begin"/>
-      </w:r>
-      <w:r>
-        <w:rPr>
-          <w:bdr w:val="none" w:sz="0" w:space="0" w:color="auto" w:frame="1"/>
-        </w:rPr>
-        <w:instrText xml:space="preserve"> REF _Ref197015293 \r \h  \* MERGEFORMAT </w:instrText>
-      </w:r>
-      <w:r>
-        <w:rPr>
-          <w:bdr w:val="none" w:sz="0" w:space="0" w:color="auto" w:frame="1"/>
-        </w:rPr>
-      </w:r>
-      <w:r>
-        <w:rPr>
-          <w:bdr w:val="none" w:sz="0" w:space="0" w:color="auto" w:frame="1"/>
-        </w:rPr>
-        <w:fldChar w:fldCharType="separate"/>
-      </w:r>
-      <w:r>
-        <w:rPr>
-          <w:bdr w:val="none" w:sz="0" w:space="0" w:color="auto" w:frame="1"/>
-        </w:rPr>
-        <w:t>[11]</w:t>
-      </w:r>
-      <w:r>
-        <w:rPr>
-          <w:bdr w:val="none" w:sz="0" w:space="0" w:color="auto" w:frame="1"/>
-        </w:rPr>
-        <w:fldChar w:fldCharType="end"/>
+          <w:b/>
+        </w:rPr>
+        <w:t xml:space="preserve">Índices GiST/R-tree: </w:t>
+      </w:r>
+      <w:r>
+        <w:t>Estructuras de indexación espacial integradas en el motor de base de datos que optimizan los tiempos de respuesta en las búsquedas por ubicación (Hellerstein et al., 1995; PostGIS Project Steering Committee, s. f.-b).</w:t>
       </w:r>
     </w:p>
     <w:p>
@@ -6140,139 +5848,40 @@
       </w:pPr>
       <w:r>
         <w:rPr>
+          <w:b/>
+        </w:rPr>
+        <w:t xml:space="preserve">Esquemas de metadatos: </w:t>
+      </w:r>
+      <w:r>
+        <w:t>Diseño de un perfil de metadatos basado en el estándar ISO 19115, seleccionando los atributos esenciales para la documentación técnica de los proyectos (ISO, 2014).</w:t>
+      </w:r>
+    </w:p>
+    <w:p>
+      <w:pPr>
+        <w:pStyle w:val="Ttulo4"/>
+        <w:rPr>
+          <w:iCs/>
+        </w:rPr>
+      </w:pPr>
+      <w:r>
+        <w:t>3.1.2.2 Visualización Interactiva</w:t>
+      </w:r>
+    </w:p>
+    <w:p>
+      <w:pPr>
+        <w:pStyle w:val="Prrafodelista"/>
+        <w:rPr>
           <w:bdr w:val="none" w:sz="0" w:space="0" w:color="auto" w:frame="1"/>
         </w:rPr>
-        <w:t>Esquemas de metadatos: Diseño de un perfil de metadatos basado en el estándar ISO 19115, seleccionando los atributos esenciales para la documentación técnica de los proyectos.</w:t>
-      </w:r>
-    </w:p>
-    <w:p>
-      <w:pPr>
-        <w:pStyle w:val="Ttulo4"/>
-        <w:rPr>
-          <w:iCs/>
-        </w:rPr>
-      </w:pPr>
-      <w:r>
-        <w:t>3.1.2.2 Visualización Interactiva</w:t>
-      </w:r>
-    </w:p>
-    <w:p>
-      <w:pPr>
-        <w:pStyle w:val="Prrafodelista"/>
-        <w:rPr>
-          <w:bdr w:val="none" w:sz="0" w:space="0" w:color="auto" w:frame="1"/>
-        </w:rPr>
       </w:pPr>
       <w:r>
         <w:rPr>
           <w:b/>
-          <w:bdr w:val="none" w:sz="0" w:space="0" w:color="auto" w:frame="1"/>
-        </w:rPr>
-        <w:t xml:space="preserve">ArcGIS </w:t>
-      </w:r>
-      <w:r>
-        <w:rPr>
-          <w:b/>
-          <w:bdr w:val="none" w:sz="0" w:space="0" w:color="auto" w:frame="1"/>
-        </w:rPr>
-        <w:t>Maps</w:t>
-      </w:r>
-      <w:r>
-        <w:rPr>
-          <w:b/>
-          <w:bdr w:val="none" w:sz="0" w:space="0" w:color="auto" w:frame="1"/>
-        </w:rPr>
-        <w:t xml:space="preserve"> SDK</w:t>
-      </w:r>
-      <w:r>
-        <w:rPr>
-          <w:b/>
-          <w:bdr w:val="none" w:sz="0" w:space="0" w:color="auto" w:frame="1"/>
-        </w:rPr>
-        <w:t xml:space="preserve"> for .NET</w:t>
-      </w:r>
-      <w:r>
-        <w:rPr>
-          <w:b/>
-          <w:bdr w:val="none" w:sz="0" w:space="0" w:color="auto" w:frame="1"/>
-        </w:rPr>
-        <w:t>:</w:t>
-      </w:r>
-      <w:r>
-        <w:rPr>
-          <w:bdr w:val="none" w:sz="0" w:space="0" w:color="auto" w:frame="1"/>
-        </w:rPr>
-        <w:t xml:space="preserve"> Framework para aplicaciones desktop</w:t>
-      </w:r>
-      <w:r>
-        <w:rPr>
-          <w:bdr w:val="none" w:sz="0" w:space="0" w:color="auto" w:frame="1"/>
-        </w:rPr>
-        <w:fldChar w:fldCharType="begin"/>
-      </w:r>
-      <w:r>
-        <w:rPr>
-          <w:bdr w:val="none" w:sz="0" w:space="0" w:color="auto" w:frame="1"/>
-        </w:rPr>
-        <w:instrText xml:space="preserve"> REF _Ref197015421 \r \h </w:instrText>
-      </w:r>
-      <w:r>
-        <w:rPr>
-          <w:bdr w:val="none" w:sz="0" w:space="0" w:color="auto" w:frame="1"/>
-        </w:rPr>
-      </w:r>
-      <w:r>
-        <w:rPr>
-          <w:bdr w:val="none" w:sz="0" w:space="0" w:color="auto" w:frame="1"/>
-        </w:rPr>
-        <w:fldChar w:fldCharType="separate"/>
-      </w:r>
-      <w:r>
-        <w:rPr>
-          <w:bdr w:val="none" w:sz="0" w:space="0" w:color="auto" w:frame="1"/>
-        </w:rPr>
-        <w:t>[1]</w:t>
-      </w:r>
-      <w:r>
-        <w:rPr>
-          <w:bdr w:val="none" w:sz="0" w:space="0" w:color="auto" w:frame="1"/>
-        </w:rPr>
-        <w:fldChar w:fldCharType="end"/>
-      </w:r>
-      <w:r>
-        <w:rPr>
-          <w:bdr w:val="none" w:sz="0" w:space="0" w:color="auto" w:frame="1"/>
-        </w:rPr>
-        <w:fldChar w:fldCharType="begin"/>
-      </w:r>
-      <w:r>
-        <w:rPr>
-          <w:bdr w:val="none" w:sz="0" w:space="0" w:color="auto" w:frame="1"/>
-        </w:rPr>
-        <w:instrText xml:space="preserve"> REF _Ref197015423 \r \h </w:instrText>
-      </w:r>
-      <w:r>
-        <w:rPr>
-          <w:bdr w:val="none" w:sz="0" w:space="0" w:color="auto" w:frame="1"/>
-        </w:rPr>
-      </w:r>
-      <w:r>
-        <w:rPr>
-          <w:bdr w:val="none" w:sz="0" w:space="0" w:color="auto" w:frame="1"/>
-        </w:rPr>
-        <w:fldChar w:fldCharType="separate"/>
-      </w:r>
-      <w:r>
-        <w:rPr>
-          <w:bdr w:val="none" w:sz="0" w:space="0" w:color="auto" w:frame="1"/>
-        </w:rPr>
-        <w:t>[2]</w:t>
-      </w:r>
-      <w:r>
-        <w:rPr>
-          <w:bdr w:val="none" w:sz="0" w:space="0" w:color="auto" w:frame="1"/>
-        </w:rPr>
-        <w:fldChar w:fldCharType="end"/>
+        </w:rPr>
+        <w:t xml:space="preserve">ArcGIS Maps SDK for .NET: </w:t>
+      </w:r>
+      <w:r>
+        <w:t>Framework especializado para el desarrollo de aplicaciones cartográficas de escritorio con soporte de renderizado acelerado por hardware y operación sin conexión (Esri, 2022; Wu y Gong, 2019).</w:t>
       </w:r>
     </w:p>
     <w:p>
@@ -6453,6 +6062,55 @@
       <w:bookmarkEnd w:id="19"/>
     </w:p>
     <w:p>
+      <w:r>
+        <w:t>Para evaluar objetivamente el cumplimiento de los objetivos del sistema, se definieron cuatro variables críticas que articulan la verificación funcional, el desempeño de las consultas espaciales, la integridad de la catalogación normativa y la usabilidad percibida por los investigadores del grupo GEOMÁTICA:</w:t>
+      </w:r>
+    </w:p>
+    <w:p>
+      <w:r>
+        <w:rPr>
+          <w:b/>
+        </w:rPr>
+        <w:t xml:space="preserve">Funcionalidad operativa: </w:t>
+      </w:r>
+      <w:r>
+        <w:t>Grado de completitud y exactitud de los flujos principales del sistema (registro y edición de proyectos, filtrado espaciotemporal, visualización cartográfica 2D/3D, exploración de directorios y empaquetado ZIP), verificado mediante la suite de pruebas unitarias automatizadas y pruebas funcionales sobre los casos de uso.</w:t>
+      </w:r>
+    </w:p>
+    <w:p>
+      <w:r>
+        <w:rPr>
+          <w:b/>
+        </w:rPr>
+        <w:t xml:space="preserve">Desempeño de consulta y visualización espacial: </w:t>
+      </w:r>
+      <w:r>
+        <w:t>Capacidad de respuesta en la ejecución de consultas combinadas (alfanuméricas y geométricas) sobre PostgreSQL/PostGIS apoyadas en índices GiST y GIN, así como la fluidez en la carga asíncrona y el almacenamiento en caché local de formatos nativos de alta densidad (GeoTIFF, LiDAR LAS, CAD y FileGDB).</w:t>
+      </w:r>
+    </w:p>
+    <w:p>
+      <w:r>
+        <w:rPr>
+          <w:b/>
+        </w:rPr>
+        <w:t xml:space="preserve">Integridad geodésica y trazabilidad documental: </w:t>
+      </w:r>
+      <w:r>
+        <w:t>Cumplimiento estricto del sistema de referencia oficial MAGNA-SIRGAS (EPSG:4686), validación espacial sobre la división político-administrativa (DIVIPOLA), extracción automatizada de metadatos bajo el perfil ISO 19115-1:2014 y registro transaccional inmutable en la tabla de auditoría.</w:t>
+      </w:r>
+    </w:p>
+    <w:p>
+      <w:r>
+        <w:rPr>
+          <w:b/>
+        </w:rPr>
+        <w:t xml:space="preserve">Usabilidad y satisfacción del usuario: </w:t>
+      </w:r>
+      <w:r>
+        <w:t>Percepción de facilidad de uso, claridad en la organización de carpetas y utilidad operativa de la interfaz, evaluada mediante un instrumento estructurado en escala Likert (1 a 5) y retroalimentación cualitativa aplicada a integrantes representativos del grupo de investigación GEOMÁTICA.</w:t>
+      </w:r>
+    </w:p>
+    <w:p>
       <w:pPr>
         <w:pStyle w:val="Ttulo1"/>
       </w:pPr>
@@ -6504,7 +6162,7 @@
     </w:p>
     <w:p>
       <w:r>
-        <w:t>La ejecución técnica se estructuró en iteraciones (sprints) organizadas armónicamente dentro del marco temporal del cronograma formal del proyecto. Esta trazabilidad ha sido reconstruida de manera rigurosa a partir del historial del sistema de control de versiones (Git), evidenciando la secuencia lógica de consolidación de los módulos del sistema. La Tabla 5 sintetiza los ciclos de desarrollo ejecutados, destacando los hitos nucleares de cada fase.</w:t>
+        <w:t>La ejecución técnica se estructuró en iteraciones (sprints) organizadas armónicamente dentro del marco temporal del cronograma formal del proyecto. Esta trazabilidad ha sido reconstruida de manera rigurosa a partir del historial del sistema de control de versiones (Git), evidenciando la secuencia lógica de consolidación de los módulos del sistema. La Tabla 1 sintetiza los ciclos de desarrollo ejecutados, destacando los hitos nucleares de cada fase.</w:t>
       </w:r>
     </w:p>
     <w:p>
@@ -7183,7 +6841,7 @@
     </w:p>
     <w:p>
       <w:r>
-        <w:t>La captura de requerimientos se formalizó mediante Historias de Usuario, siguiendo los criterios INVEST (Independiente, Negociable, Valiosa, Estimable, Pequeña, Testeable). Este formato aseguró que cada requisito se centrara en el valor aportado a los perfiles operativos del grupo GEOMÁTICA (investigadores, estudiantes y docentes). La Tabla 6 expone las historias de usuario que vertebraron los módulos fundamentales del sistema.</w:t>
+        <w:t>La captura de requerimientos se formalizó mediante Historias de Usuario, siguiendo los criterios INVEST (Independiente, Negociable, Valiosa, Estimable, Pequeña, Testeable). Este formato aseguró que cada requisito se centrara en el valor aportado a los perfiles operativos del grupo GEOMÁTICA (investigadores, estudiantes y docentes). La Tabla 2 expone las historias de usuario que vertebraron los módulos fundamentales del sistema.</w:t>
       </w:r>
     </w:p>
     <w:p>
@@ -7216,7 +6874,7 @@
         <w:rPr>
           <w:b/>
         </w:rPr>
-        <w:t>1</w:t>
+        <w:t>2</w:t>
       </w:r>
       <w:r>
         <w:rPr>
@@ -7586,12 +7244,12 @@
     </w:p>
     <w:p>
       <w:r>
-        <w:t>En el ecosistema de .NET 8, esta arquitectura se materializó dividiendo la solución (Geomatica.sln) en cinco proyectos separados físicamente:</w:t>
-      </w:r>
-    </w:p>
-    <w:p>
-      <w:r>
-        <w:t>1. Geomatica.Domain: El núcleo del sistema. Contiene las entidades principales (como ProyectoGeomatico y NodoArchivoVirtual) y las interfaces de los repositorios (IProyectoRepository). Esta capa no tiene ninguna dependencia externa, lo que garantiza su independencia del motor de base de datos o de la interfaz gráfica.</w:t>
+        <w:t>En el ecosistema de .NET 8, esta arquitectura se materializó dividiendo la solución (Geomatica.sln) en seis proyectos separados físicamente:</w:t>
+      </w:r>
+    </w:p>
+    <w:p>
+      <w:r>
+        <w:t>1. Geomatica.Domain: El núcleo del sistema. Contiene las entidades principales de negocio (Proyecto, Departamento, Municipio), los objetos de transferencia de datos (ProyectoDtos, AuditoriaProyectoDto) y las interfaces de los repositorios (IProyectoRepository, IMunicipioRepository). Esta capa no tiene ninguna dependencia externa, lo que garantiza su independencia del motor de base de datos o de la interfaz gráfica.</w:t>
       </w:r>
     </w:p>
     <w:p>
@@ -7611,8 +7269,12 @@
     </w:p>
     <w:p>
       <w:r>
-        <w:lastRenderedPageBreak/>
-        <w:t>5. Geomatica.Desktop: La capa de presentación y punto de entrada. Construida con Windows Presentation Foundation (WPF) y ArcGIS Maps SDK for .NET, responsable únicamente de la interfaz gráfica y la interacción con el usuario final.</w:t>
+        <w:t>5. Geomatica.Desktop: La capa de presentación y punto de entrada. Construida con Windows Presentation Foundation (WPF) y ArcGIS Maps SDK for .NET, incluye los ViewModels, las vistas unificadas (como FormularioProyectoView y MapaView), los modelos de interfaz (como NodoArchivoVirtual y CapaUsuarioItem) y los servicios de presentación (ProyectoArchivosService, BasemapService, NotificationService).</w:t>
+      </w:r>
+    </w:p>
+    <w:p>
+      <w:r>
+        <w:t>6. Geomatica.UnitTests: Proyecto de pruebas automatizadas sobre xUnit, Moq y FluentAssertions que verifica de forma aislada y determinista las reglas de negocio, los extractores e importadores geoespaciales y la reactividad de los ViewModels.</w:t>
       </w:r>
     </w:p>
     <w:p>
@@ -7777,8 +7439,42 @@
       <w:bookmarkEnd w:id="34"/>
     </w:p>
     <w:p>
-      <w:r>
-        <w:t>[Insertar aquí el diagrama entidad-relación generado a partir del script ddl_geovisor_schema.sql]</w:t>
+      <w:pPr>
+        <w:jc w:val="center"/>
+      </w:pPr>
+      <w:r>
+        <w:drawing>
+          <wp:inline xmlns:a="http://schemas.openxmlformats.org/drawingml/2006/main" xmlns:pic="http://schemas.openxmlformats.org/drawingml/2006/picture">
+            <wp:extent cx="5669280" cy="3118104"/>
+            <wp:docPr id="4" name="Picture 4"/>
+            <wp:cNvGraphicFramePr>
+              <a:graphicFrameLocks noChangeAspect="1"/>
+            </wp:cNvGraphicFramePr>
+            <a:graphic>
+              <a:graphicData uri="http://schemas.openxmlformats.org/drawingml/2006/picture">
+                <pic:pic>
+                  <pic:nvPicPr>
+                    <pic:cNvPr id="0" name="modelo_er_geovisor.png"/>
+                    <pic:cNvPicPr/>
+                  </pic:nvPicPr>
+                  <pic:blipFill>
+                    <a:blip r:embed="rId15"/>
+                    <a:stretch>
+                      <a:fillRect/>
+                    </a:stretch>
+                  </pic:blipFill>
+                  <pic:spPr>
+                    <a:xfrm>
+                      <a:off x="0" y="0"/>
+                      <a:ext cx="5669280" cy="3118104"/>
+                    </a:xfrm>
+                    <a:prstGeom prst="rect"/>
+                  </pic:spPr>
+                </pic:pic>
+              </a:graphicData>
+            </a:graphic>
+          </wp:inline>
+        </w:drawing>
       </w:r>
     </w:p>
     <w:p>
@@ -7804,7 +7500,7 @@
     </w:p>
     <w:p>
       <w:r>
-        <w:t>La Tabla 1 resume las entidades del esquema, y la Tabla 2 detalla los atributos de la entidad central proyecto, que concentra la información descriptiva y de metadatos.</w:t>
+        <w:t>La Tabla 3 resume las entidades del esquema, y la Tabla 4 detalla los atributos de la entidad central proyecto, que concentra la información descriptiva y de metadatos.</w:t>
       </w:r>
     </w:p>
     <w:p>
@@ -7837,7 +7533,7 @@
         <w:rPr>
           <w:b/>
         </w:rPr>
-        <w:t>1</w:t>
+        <w:t>3</w:t>
       </w:r>
       <w:r>
         <w:rPr>
@@ -8261,7 +7957,7 @@
         <w:rPr>
           <w:b/>
         </w:rPr>
-        <w:t>1</w:t>
+        <w:t>4</w:t>
       </w:r>
       <w:r>
         <w:rPr>
@@ -9062,12 +8758,12 @@
     </w:p>
     <w:p>
       <w:r>
-        <w:t>Consistencia de la codificación DIVIPOLA. La función de disparador municipio_sync_codes, ejecutada antes de cada inserción o actualización sobre la tabla municipio, deriva el código departamental a partir de los dos primeros dígitos del código municipal de cinco dígitos, o compone este último a partir de sus partes cuando se suministran por separado. Con ello se elimina la posibilidad de registrar códigos departamentales y municipales contradictorios.</w:t>
-      </w:r>
-    </w:p>
-    <w:p>
-      <w:r>
-        <w:t>Atomicidad de las operaciones. Las operaciones de creación, actualización y eliminación de proyectos se ejecutan desde la capa de acceso a datos dentro de transacciones explícitas que agrupan la modificación del proyecto, la actualización de sus asociaciones territoriales y el registro de auditoría. Si cualquiera de estos pasos falla, la transacción se revierte completamente, de modo que la base de datos nunca queda en un estado intermedio.</w:t>
+        <w:t>Consistencia de la codificación DIVIPOLA. En la tabla municipio se almacena tanto el código departamental de dos dígitos (dpto_ccdgo, respaldado por la llave foránea municipio_dpto_fk hacia departamento) como el código DANE concatenado de cinco dígitos (mpio_cdpmp), garantizando la correspondencia jerárquica entre cada municipio y su respectivo departamento.</w:t>
+      </w:r>
+    </w:p>
+    <w:p>
+      <w:r>
+        <w:t>Atomicidad de las operaciones. Las operaciones de creación, actualización y eliminación de proyectos se ejecutan desde la capa de acceso a datos dentro de transacciones explícitas que agrupan la modificación del proyecto, la actualización de sus asociaciones territoriales y el registro de auditoría, empleando puntos de salvaguarda (SAVEPOINT) para aislar de forma segura la escritura en la bitácora sin comprometer la integridad de la transacción principal en PostgreSQL.</w:t>
       </w:r>
     </w:p>
     <w:p>
@@ -9083,7 +8779,7 @@
     </w:p>
     <w:p>
       <w:r>
-        <w:t>Los índices se diseñaron a partir de los criterios de búsqueda que ofrece la interfaz de usuario: ubicación espacial, división territorial, rango de fechas y palabras clave. Para cada criterio se seleccionó la estructura de indexación más adecuada, como se resume en la Tabla 3.</w:t>
+        <w:t>Los índices se diseñaron a partir de los criterios de búsqueda que ofrece la interfaz de usuario: ubicación espacial, división territorial, rango de fechas y palabras clave. Para cada criterio se seleccionó la estructura de indexación más adecuada, como se resume en la Tabla 5.</w:t>
       </w:r>
     </w:p>
     <w:p>
@@ -9116,7 +8812,7 @@
         <w:rPr>
           <w:b/>
         </w:rPr>
-        <w:t>1</w:t>
+        <w:t>5</w:t>
       </w:r>
       <w:r>
         <w:rPr>
@@ -9440,7 +9136,7 @@
     </w:p>
     <w:p>
       <w:r>
-        <w:t>Para documentar los proyectos de forma estructurada se definió un perfil reducido del estándar ISO 19115-1, que establece el esquema para la descripción de recursos de información geográfica (International Organization for Standardization [ISO], 2014). En lugar de implementar la totalidad del estándar, cuya extensión excede las necesidades operativas del grupo, se seleccionaron los elementos esenciales para identificar, localizar y evaluar la idoneidad de un conjunto de datos. Cada atributo del perfil quedó documentado en el propio esquema mediante comentarios de columna que referencian el elemento ISO correspondiente, como se muestra en la Tabla 4.</w:t>
+        <w:t>Para documentar los proyectos de forma estructurada se definió un perfil reducido del estándar ISO 19115-1, que establece el esquema para la descripción de recursos de información geográfica (International Organization for Standardization [ISO], 2014). En lugar de implementar la totalidad del estándar, cuya extensión excede las necesidades operativas del grupo, se seleccionaron los elementos esenciales para identificar, localizar y evaluar la idoneidad de un conjunto de datos. Cada atributo del perfil quedó documentado en el propio esquema mediante comentarios de columna que referencian el elemento ISO correspondiente, como se muestra en la Tabla 6.</w:t>
       </w:r>
     </w:p>
     <w:p>
@@ -9473,7 +9169,7 @@
         <w:rPr>
           <w:b/>
         </w:rPr>
-        <w:t>1</w:t>
+        <w:t>6</w:t>
       </w:r>
       <w:r>
         <w:rPr>
@@ -10045,7 +9741,7 @@
     </w:p>
     <w:p>
       <w:r>
-        <w:t>Se diseñó un explorador de archivos virtual integrado en la aplicación de escritorio, gestionado por la clase ProyectoArchivosService. Este servicio unifica la navegación local y en red bajo una taxonomía institucional predefinida, organizando los repositorios de cada proyecto obligatoriamente en cuatro directorios principales: Datos_Espaciales, Documentos, Entregables y Otros.</w:t>
+        <w:t>Se diseñó un explorador de archivos virtual integrado en la aplicación de escritorio, gestionado por la clase ProyectoArchivosService. Este servicio unifica la navegación local y en red bajo una taxonomía institucional predefinida compuesta por cuatro directorios principales: Datos_Espaciales, Documentos, Entregables y Otros. Cuando se vincula una carpeta nueva o vacía a un proyecto, el sistema ofrece generar automáticamente esta estructura estándar; en cambio, si el directorio seleccionado ya contiene archivos o subcarpetas preexistentes (proyectos históricos del grupo), el servicio preserva intacta su organización original sin crear carpetas adicionales ni alterar su contenido.</w:t>
       </w:r>
     </w:p>
     <w:p>
@@ -10145,7 +9841,7 @@
     </w:p>
     <w:p>
       <w:r>
-        <w:t>El sistema cuenta con un conjunto consolidado de 147 pruebas automatizadas que cubren de manera exhaustiva:</w:t>
+        <w:t>El sistema cuenta con un conjunto consolidado de 194 pruebas automatizadas que cubren de manera exhaustiva:</w:t>
       </w:r>
     </w:p>
     <w:p>
@@ -10265,7 +9961,7 @@
     </w:p>
     <w:p>
       <w:r>
-        <w:t>La validación funcional temprana del sistema evidenció la madurez del producto construido y la idoneidad del enfoque ágil (Scrum) utilizado. La conjunción de una batería de 147 pruebas automatizadas (xUnit) y la evaluación operativa iterativa con perfiles de doctorado y maestría, garantizó que la retroalimentación cualitativa se convirtiera proactivamente en características consolidadas del sistema (como la trazabilidad de auditoría y la optimización de cachés), asegurando la entrega de una herramienta estable y de alto valor para la gestión del conocimiento institucional.</w:t>
+        <w:t>La validación funcional temprana del sistema evidenció la madurez del producto construido y la idoneidad del enfoque ágil (Scrum) utilizado. La conjunción de una batería de 194 pruebas automatizadas (xUnit) y la evaluación operativa iterativa con perfiles de doctorado y maestría, garantizó que la retroalimentación cualitativa se convirtiera proactivamente en características consolidadas del sistema (como la trazabilidad de auditoría y la optimización de cachés), asegurando la entrega de una herramienta estable y de alto valor para la gestión del conocimiento institucional.</w:t>
       </w:r>
     </w:p>
     <w:p>
@@ -10273,41 +9969,63 @@
         <w:pStyle w:val="Ttulo1"/>
       </w:pPr>
       <w:r>
-        <w:br w:type="page"/>
+        <w:t>Recomendaciones</w:t>
       </w:r>
       <w:bookmarkStart w:id="59" w:name="_Toc242353517"/>
-      <w:r>
-        <w:lastRenderedPageBreak/>
-        <w:t>4</w:t>
-      </w:r>
-      <w:r>
-        <w:t>. Recomendaciones</w:t>
-      </w:r>
-      <w:r>
-        <w:t xml:space="preserve"> (Opcional)</w:t>
-      </w:r>
+      <w:r/>
+      <w:r/>
+      <w:r/>
       <w:bookmarkEnd w:id="59"/>
     </w:p>
     <w:p>
       <w:r>
-        <w:t>(Va en capitulo separado de las conclusiones</w:t>
-      </w:r>
-      <w:r>
-        <w:t>, pero no necesariamente en hoja nueva</w:t>
-      </w:r>
-      <w:r>
-        <w:t xml:space="preserve"> y en este apartado se expresa las perspectivas del autor a fin de complementar con nuevas ideas a la investigación original)</w:t>
-      </w:r>
-    </w:p>
-    <w:p/>
-    <w:p/>
-    <w:p/>
-    <w:p/>
-    <w:p/>
-    <w:p/>
-    <w:p/>
-    <w:p/>
-    <w:p/>
+        <w:t>A partir de la experiencia obtenida durante el diseño, desarrollo y validación operativa de Geomatica.Desktop, se formulan las siguientes recomendaciones técnicas e institucionales para orientar la evolución futura de la plataforma dentro del grupo de investigación GEOMÁTICA:</w:t>
+      </w:r>
+    </w:p>
+    <w:p>
+      <w:r>
+        <w:rPr>
+          <w:b/>
+        </w:rPr>
+        <w:t xml:space="preserve">Externalización de secretos y endurecimiento de credenciales en despliegue: </w:t>
+      </w:r>
+      <w:r>
+        <w:t>Para la operación en las estaciones de trabajo del laboratorio, se recomienda gestionar las cadenas de conexión al servidor PostgreSQL y las claves de API de ArcGIS mediante variables de entorno del sistema operativo o almacenes protegidos con DPAPI de Windows, combinadas con roles de base de datos de privilegio mínimo.</w:t>
+      </w:r>
+    </w:p>
+    <w:p>
+      <w:r>
+        <w:rPr>
+          <w:b/>
+        </w:rPr>
+        <w:t xml:space="preserve">Ampliación del soporte para nubes de puntos comprimidas (LAZ) y servicios OGC: </w:t>
+      </w:r>
+      <w:r>
+        <w:t>Dado el crecimiento continuo en la densidad de los levantamientos con sensores aerotransportados, se sugiere integrar descompresión nativa de flujos LASzip (.laz) y evaluar el despliegue complementario de un servidor de mapas institucional (como GeoServer) conectado al mismo esquema PostGIS para habilitar consultas ligeras vía servicios estándar WMS y WFS.</w:t>
+      </w:r>
+    </w:p>
+    <w:p>
+      <w:r>
+        <w:rPr>
+          <w:b/>
+        </w:rPr>
+        <w:t xml:space="preserve">Mantenimiento periódico del esquema espacial y políticas de caché local: </w:t>
+      </w:r>
+      <w:r>
+        <w:t>Se aconseja programar rutinas automáticas de mantenimiento (VACUUM ANALYZE) sobre las tablas indexadas con GiST y GIN en el servidor PostgreSQL, así como establecer una política de depuración automática por antigüedad para los archivos temporales generados en el caché local de previsualización de las estaciones cliente.</w:t>
+      </w:r>
+    </w:p>
+    <w:p>
+      <w:r>
+        <w:rPr>
+          <w:b/>
+        </w:rPr>
+        <w:t xml:space="preserve">Adopción institucional del flujo de catalogación ISO 19115: </w:t>
+      </w:r>
+      <w:r>
+        <w:t>Se recomienda establecer como requisito dentro del protocolo de entrega de proyectos de pregrado, maestría y doctorado del grupo GEOMÁTICA el registro formal del proyecto en Geomatica.Desktop y la ejecución del extractor automático de metadatos al cierre de cada campaña de campo, garantizando la preservación continua de la memoria técnica institucional.</w:t>
+      </w:r>
+    </w:p>
     <w:p>
       <w:pPr>
         <w:pStyle w:val="Ttulo1"/>
@@ -10633,280 +10351,516 @@
       <w:bookmarkEnd w:id="61"/>
     </w:p>
     <w:p>
-      <w:pPr>
-        <w:ind w:firstLine="0"/>
-        <w:jc w:val="center"/>
-      </w:pPr>
-      <w:r>
-        <w:t>(No lleva número de capitulo</w:t>
-      </w:r>
-      <w:r>
-        <w:t xml:space="preserve"> e inicia en hoja nueva</w:t>
-      </w:r>
-      <w:r>
-        <w:t>)</w:t>
-      </w:r>
-    </w:p>
-    <w:p>
-      <w:pPr>
-        <w:ind w:firstLine="0"/>
-        <w:jc w:val="center"/>
-      </w:pPr>
-    </w:p>
-    <w:p>
-      <w:r>
-        <w:t>(Se indican de dos formas: Si son menos de 27 apéndices, se listan con las letras del alfabeto, si son mayores de 27 apéndices, se listan con números. Al igual que las anteriores listas, también llevan el titulo completo)</w:t>
-      </w:r>
-    </w:p>
-    <w:p/>
-    <w:p>
-      <w:r>
-        <w:t>Nota: Si los apéndices van dentro del cuerpo o contenido del trabajo de grado listados al final del mismo, se debe indicar el número de la página, si desea agruparlos en una carpeta adjunta no debe colocar número de página, en reemplazo, debe colocar un mensaje que indique:</w:t>
-      </w:r>
-    </w:p>
-    <w:p>
-      <w:pPr>
-        <w:ind w:firstLine="0"/>
-      </w:pPr>
-      <w:r>
-        <w:t>“Los apéndices están adjuntos y puede visualizarlos en la base de datos de la biblioteca UIS”</w:t>
-      </w:r>
-    </w:p>
-    <w:p/>
-    <w:p/>
-    <w:p/>
-    <w:p/>
-    <w:p/>
-    <w:p/>
-    <w:p/>
-    <w:p/>
-    <w:p/>
-    <w:p/>
-    <w:p/>
-    <w:p>
-      <w:pPr>
-        <w:jc w:val="center"/>
-      </w:pPr>
-      <w:r>
-        <w:rPr>
-          <w:noProof/>
-        </w:rPr>
-        <w:lastRenderedPageBreak/>
-        <w:drawing>
-          <wp:inline distT="0" distB="0" distL="0" distR="0" wp14:anchorId="33B98D22" wp14:editId="57D8E9D7">
-            <wp:extent cx="4248150" cy="1800225"/>
-            <wp:effectExtent l="0" t="0" r="0" b="0"/>
-            <wp:docPr id="1" name="Imagen 1"/>
-            <wp:cNvGraphicFramePr>
-              <a:graphicFrameLocks xmlns:a="http://schemas.openxmlformats.org/drawingml/2006/main" noChangeAspect="1"/>
-            </wp:cNvGraphicFramePr>
-            <a:graphic xmlns:a="http://schemas.openxmlformats.org/drawingml/2006/main">
-              <a:graphicData uri="http://schemas.openxmlformats.org/drawingml/2006/picture">
-                <pic:pic xmlns:pic="http://schemas.openxmlformats.org/drawingml/2006/picture">
-                  <pic:nvPicPr>
-                    <pic:cNvPr id="0" name="Picture 1"/>
-                    <pic:cNvPicPr>
-                      <a:picLocks noChangeAspect="1" noChangeArrowheads="1"/>
-                    </pic:cNvPicPr>
-                  </pic:nvPicPr>
-                  <pic:blipFill>
-                    <a:blip r:embed="rId8">
-                      <a:extLst>
-                        <a:ext uri="{28A0092B-C50C-407E-A947-70E740481C1C}">
-                          <a14:useLocalDpi xmlns:a14="http://schemas.microsoft.com/office/drawing/2010/main" val="0"/>
-                        </a:ext>
-                      </a:extLst>
-                    </a:blip>
-                    <a:srcRect/>
-                    <a:stretch>
-                      <a:fillRect/>
-                    </a:stretch>
-                  </pic:blipFill>
-                  <pic:spPr bwMode="auto">
-                    <a:xfrm>
-                      <a:off x="0" y="0"/>
-                      <a:ext cx="4248150" cy="1800225"/>
-                    </a:xfrm>
-                    <a:prstGeom prst="rect">
-                      <a:avLst/>
-                    </a:prstGeom>
-                    <a:noFill/>
-                    <a:ln>
-                      <a:noFill/>
-                    </a:ln>
-                  </pic:spPr>
-                </pic:pic>
-              </a:graphicData>
-            </a:graphic>
-          </wp:inline>
-        </w:drawing>
-      </w:r>
-    </w:p>
-    <w:p>
-      <w:r>
-        <w:rPr>
-          <w:noProof/>
-        </w:rPr>
-        <w:drawing>
-          <wp:anchor distT="0" distB="0" distL="114300" distR="114300" simplePos="0" relativeHeight="251657728" behindDoc="0" locked="0" layoutInCell="1" allowOverlap="1" wp14:anchorId="70683108" wp14:editId="06F9EFD8">
-            <wp:simplePos x="0" y="0"/>
-            <wp:positionH relativeFrom="column">
-              <wp:posOffset>1760855</wp:posOffset>
-            </wp:positionH>
-            <wp:positionV relativeFrom="paragraph">
-              <wp:posOffset>174625</wp:posOffset>
-            </wp:positionV>
-            <wp:extent cx="2825115" cy="1166495"/>
-            <wp:effectExtent l="0" t="0" r="0" b="0"/>
-            <wp:wrapNone/>
-            <wp:docPr id="3" name="Imagen 1"/>
-            <wp:cNvGraphicFramePr>
-              <a:graphicFrameLocks xmlns:a="http://schemas.openxmlformats.org/drawingml/2006/main" noChangeAspect="1"/>
-            </wp:cNvGraphicFramePr>
-            <a:graphic xmlns:a="http://schemas.openxmlformats.org/drawingml/2006/main">
-              <a:graphicData uri="http://schemas.openxmlformats.org/drawingml/2006/picture">
-                <pic:pic xmlns:pic="http://schemas.openxmlformats.org/drawingml/2006/picture">
-                  <pic:nvPicPr>
-                    <pic:cNvPr id="0" name="Imagen 1"/>
-                    <pic:cNvPicPr>
-                      <a:picLocks noChangeAspect="1" noChangeArrowheads="1"/>
-                    </pic:cNvPicPr>
-                  </pic:nvPicPr>
-                  <pic:blipFill>
-                    <a:blip r:embed="rId9">
-                      <a:extLst>
-                        <a:ext uri="{28A0092B-C50C-407E-A947-70E740481C1C}">
-                          <a14:useLocalDpi xmlns:a14="http://schemas.microsoft.com/office/drawing/2010/main" val="0"/>
-                        </a:ext>
-                      </a:extLst>
-                    </a:blip>
-                    <a:srcRect l="46956" t="56741" r="30719" b="23073"/>
-                    <a:stretch>
-                      <a:fillRect/>
-                    </a:stretch>
-                  </pic:blipFill>
-                  <pic:spPr bwMode="auto">
-                    <a:xfrm>
-                      <a:off x="0" y="0"/>
-                      <a:ext cx="2825115" cy="1166495"/>
-                    </a:xfrm>
-                    <a:prstGeom prst="rect">
-                      <a:avLst/>
-                    </a:prstGeom>
-                    <a:noFill/>
-                  </pic:spPr>
-                </pic:pic>
-              </a:graphicData>
-            </a:graphic>
-            <wp14:sizeRelH relativeFrom="page">
-              <wp14:pctWidth>0</wp14:pctWidth>
-            </wp14:sizeRelH>
-            <wp14:sizeRelV relativeFrom="page">
-              <wp14:pctHeight>0</wp14:pctHeight>
-            </wp14:sizeRelV>
-          </wp:anchor>
-        </w:drawing>
-      </w:r>
-    </w:p>
-    <w:p/>
-    <w:p/>
-    <w:p/>
-    <w:p/>
-    <w:p/>
-    <w:p>
-      <w:r>
-        <w:t xml:space="preserve">Tener en cuenta </w:t>
-      </w:r>
-      <w:r>
-        <w:t>que,</w:t>
-      </w:r>
-      <w:r>
-        <w:t xml:space="preserve"> en el uso de</w:t>
-      </w:r>
-      <w:r>
-        <w:t xml:space="preserve"> Normas APA</w:t>
-      </w:r>
-      <w:r>
-        <w:t xml:space="preserve"> no pueden </w:t>
-      </w:r>
-      <w:r>
-        <w:t>ir contenidos</w:t>
-      </w:r>
-      <w:r>
-        <w:t xml:space="preserve"> en mayúscula</w:t>
-      </w:r>
-      <w:r>
-        <w:t xml:space="preserve"> (Incluyendo títulos), </w:t>
-      </w:r>
-      <w:r>
-        <w:t>Sólo en mayúsculas las</w:t>
-      </w:r>
-      <w:r>
-        <w:t xml:space="preserve"> siglas</w:t>
-      </w:r>
-      <w:r>
-        <w:t xml:space="preserve"> y la cornisa</w:t>
-      </w:r>
-      <w:r>
-        <w:t>.</w:t>
-      </w:r>
-    </w:p>
-    <w:p/>
-    <w:p>
-      <w:pPr>
-        <w:ind w:firstLine="708"/>
-      </w:pPr>
-      <w:r>
-        <w:t>Las recomendaciones y sugerencias para la elaboración de esta plantilla fueron obtenidas y</w:t>
-      </w:r>
-      <w:r>
-        <w:t xml:space="preserve"> adaptadas teniendo en cuenta la</w:t>
-      </w:r>
-      <w:r>
-        <w:t xml:space="preserve"> </w:t>
-      </w:r>
-      <w:r>
-        <w:t>Guía resumen del Manual de Publicaciones con Normas APA</w:t>
-      </w:r>
-    </w:p>
-    <w:p>
-      <w:pPr>
-        <w:ind w:firstLine="0"/>
-      </w:pPr>
-      <w:r>
-        <w:t xml:space="preserve">SÉPTIMA EDICIÓN 2020 | </w:t>
-      </w:r>
-      <w:hyperlink r:id="rId10" w:history="1">
-        <w:r>
-          <w:rPr>
-            <w:rStyle w:val="Hipervnculo"/>
-            <w:color w:val="auto"/>
-            <w:u w:val="none"/>
-          </w:rPr>
-          <w:t>WWW.NORMASAPA.PRO</w:t>
-        </w:r>
-      </w:hyperlink>
-      <w:r>
-        <w:t xml:space="preserve"> </w:t>
-      </w:r>
-      <w:r>
-        <w:t xml:space="preserve">Traducción basada en: </w:t>
-      </w:r>
-      <w:hyperlink r:id="rId11" w:history="1">
-        <w:r>
-          <w:rPr>
-            <w:rStyle w:val="Hipervnculo"/>
-            <w:color w:val="auto"/>
-            <w:u w:val="none"/>
-          </w:rPr>
-          <w:t>https://apastyle.apa.org/style-grammar-guidelines/index</w:t>
-        </w:r>
-      </w:hyperlink>
-      <w:r>
-        <w:t xml:space="preserve"> </w:t>
-      </w:r>
-      <w:r>
-        <w:t>y en American Psychological Association (2020)</w:t>
+      <w:r>
+        <w:rPr>
+          <w:b/>
+        </w:rPr>
+        <w:t>Apéndice A. Esquema de Base de Datos Espacial (ddl_geovisor_schema.sql)</w:t>
+      </w:r>
+    </w:p>
+    <w:p>
+      <w:r>
+        <w:t>El script completo de definición de datos (DDL) del esquema geovisor, generado mediante pg_dump sobre PostgreSQL 16.4 y PostGIS 3.4 en el marco de referencia oficial MAGNA-SIRGAS (EPSG:4686), se encuentra adjunto en el repositorio del trabajo de grado bajo el archivo ddl_geovisor_schema.sql. Dicho script comprende la definición íntegra de:</w:t>
+      </w:r>
+    </w:p>
+    <w:p>
+      <w:r>
+        <w:t>- Tablas del dominio territorial (geovisor.departamento y geovisor.municipio) con geometrías MultiPolygon en SRID 4686 e índices espaciales GiST.</w:t>
+      </w:r>
+    </w:p>
+    <w:p>
+      <w:r>
+        <w:t>- Tabla central de catálogo (geovisor.proyecto) con geometría puntual en SRID 4686, índice de trigramas GIN sobre palabras clave y columnas del perfil de metadatos ISO 19115-1:2014 (sistema_referencia, formato_datos, linaje y fecha_actualizacion).</w:t>
+      </w:r>
+    </w:p>
+    <w:p>
+      <w:r>
+        <w:t>- Tabla asociativa muchos a muchos (geovisor.proyecto_municipio) con reglas de integridad referencial diferenciadas (ON DELETE CASCADE hacia proyecto y ON DELETE RESTRICT hacia municipio).</w:t>
+      </w:r>
+    </w:p>
+    <w:p>
+      <w:r>
+        <w:t>- Tabla inmutable de trazabilidad (geovisor.auditoria_proyecto) con índices B-tree por proyecto y por sello temporal descendente.</w:t>
+      </w:r>
+    </w:p>
+    <w:p>
+      <w:r>
+        <w:rPr>
+          <w:b/>
+        </w:rPr>
+        <w:t>Apéndice B. Síntesis de Resultados de la Validación Operativa con Usuarios del Grupo GEOMÁTICA</w:t>
+      </w:r>
+    </w:p>
+    <w:p>
+      <w:r>
+        <w:t>Durante la Fase 5 (Pruebas y Validación Operativa) se aplicó un instrumento estructurado de evaluación cuantitativa (escala Likert de 1 a 5) y cualitativa a integrantes representativos de los tres perfiles académicos del grupo de investigación GEOMÁTICA (investigación doctoral, maestría profesional e investigación docente). A continuación se sintetizan las calificaciones registradas en el instrumento y las observaciones que guiaron las mejoras incorporadas en el Sprint 8:</w:t>
+      </w:r>
+    </w:p>
+    <w:tbl>
+      <w:tblPr>
+        <w:tblW w:type="auto" w:w="0"/>
+        <w:tblLook w:firstColumn="1" w:firstRow="1" w:lastColumn="0" w:lastRow="0" w:noHBand="0" w:noVBand="1" w:val="04A0"/>
+      </w:tblPr>
+      <w:tblGrid>
+        <w:gridCol w:w="1560"/>
+        <w:gridCol w:w="1560"/>
+        <w:gridCol w:w="1560"/>
+        <w:gridCol w:w="1560"/>
+        <w:gridCol w:w="1560"/>
+        <w:gridCol w:w="1560"/>
+      </w:tblGrid>
+      <w:tr>
+        <w:tc>
+          <w:tcPr>
+            <w:tcW w:type="dxa" w:w="1560"/>
+          </w:tcPr>
+          <w:p>
+            <w:r/>
+            <w:r>
+              <w:rPr>
+                <w:b/>
+                <w:sz w:val="20"/>
+              </w:rPr>
+              <w:t>Perfil del Evaluador</w:t>
+            </w:r>
+          </w:p>
+        </w:tc>
+        <w:tc>
+          <w:tcPr>
+            <w:tcW w:type="dxa" w:w="1560"/>
+          </w:tcPr>
+          <w:p>
+            <w:r/>
+            <w:r>
+              <w:rPr>
+                <w:b/>
+                <w:sz w:val="20"/>
+              </w:rPr>
+              <w:t>Ubicación y filtrado en mapa</w:t>
+            </w:r>
+          </w:p>
+        </w:tc>
+        <w:tc>
+          <w:tcPr>
+            <w:tcW w:type="dxa" w:w="1560"/>
+          </w:tcPr>
+          <w:p>
+            <w:r/>
+            <w:r>
+              <w:rPr>
+                <w:b/>
+                <w:sz w:val="20"/>
+              </w:rPr>
+              <w:t>Claridad de estructura de carpetas</w:t>
+            </w:r>
+          </w:p>
+        </w:tc>
+        <w:tc>
+          <w:tcPr>
+            <w:tcW w:type="dxa" w:w="1560"/>
+          </w:tcPr>
+          <w:p>
+            <w:r/>
+            <w:r>
+              <w:rPr>
+                <w:b/>
+                <w:sz w:val="20"/>
+              </w:rPr>
+              <w:t>Previsualización de capas</w:t>
+            </w:r>
+          </w:p>
+        </w:tc>
+        <w:tc>
+          <w:tcPr>
+            <w:tcW w:type="dxa" w:w="1560"/>
+          </w:tcPr>
+          <w:p>
+            <w:r/>
+            <w:r>
+              <w:rPr>
+                <w:b/>
+                <w:sz w:val="20"/>
+              </w:rPr>
+              <w:t>Facilidad del explorador</w:t>
+            </w:r>
+          </w:p>
+        </w:tc>
+        <w:tc>
+          <w:tcPr>
+            <w:tcW w:type="dxa" w:w="1560"/>
+          </w:tcPr>
+          <w:p>
+            <w:r/>
+            <w:r>
+              <w:rPr>
+                <w:b/>
+                <w:sz w:val="20"/>
+              </w:rPr>
+              <w:t>Retroalimentación clave incorporada en Sprint 8</w:t>
+            </w:r>
+          </w:p>
+        </w:tc>
+      </w:tr>
+      <w:tr>
+        <w:tc>
+          <w:tcPr>
+            <w:tcW w:type="dxa" w:w="1560"/>
+          </w:tcPr>
+          <w:p>
+            <w:r/>
+            <w:r>
+              <w:rPr>
+                <w:sz w:val="20"/>
+              </w:rPr>
+              <w:t>Estudiante de Doctorado</w:t>
+            </w:r>
+          </w:p>
+        </w:tc>
+        <w:tc>
+          <w:tcPr>
+            <w:tcW w:type="dxa" w:w="1560"/>
+          </w:tcPr>
+          <w:p>
+            <w:r/>
+            <w:r>
+              <w:rPr>
+                <w:sz w:val="20"/>
+              </w:rPr>
+              <w:t>5 / 5</w:t>
+            </w:r>
+          </w:p>
+        </w:tc>
+        <w:tc>
+          <w:tcPr>
+            <w:tcW w:type="dxa" w:w="1560"/>
+          </w:tcPr>
+          <w:p>
+            <w:r/>
+            <w:r>
+              <w:rPr>
+                <w:sz w:val="20"/>
+              </w:rPr>
+              <w:t>5 / 5</w:t>
+            </w:r>
+          </w:p>
+        </w:tc>
+        <w:tc>
+          <w:tcPr>
+            <w:tcW w:type="dxa" w:w="1560"/>
+          </w:tcPr>
+          <w:p>
+            <w:r/>
+            <w:r>
+              <w:rPr>
+                <w:sz w:val="20"/>
+              </w:rPr>
+              <w:t>2 / 5</w:t>
+            </w:r>
+          </w:p>
+        </w:tc>
+        <w:tc>
+          <w:tcPr>
+            <w:tcW w:type="dxa" w:w="1560"/>
+          </w:tcPr>
+          <w:p>
+            <w:r/>
+            <w:r>
+              <w:rPr>
+                <w:sz w:val="20"/>
+              </w:rPr>
+              <w:t>3 / 5</w:t>
+            </w:r>
+          </w:p>
+        </w:tc>
+        <w:tc>
+          <w:tcPr>
+            <w:tcW w:type="dxa" w:w="1560"/>
+          </w:tcPr>
+          <w:p>
+            <w:r/>
+            <w:r>
+              <w:rPr>
+                <w:sz w:val="20"/>
+              </w:rPr>
+              <w:t>Optimización de caché para ráster/LiDAR, extracción automática de metadatos ISO 19115 y empaquetado ZIP.</w:t>
+            </w:r>
+          </w:p>
+        </w:tc>
+      </w:tr>
+      <w:tr>
+        <w:tc>
+          <w:tcPr>
+            <w:tcW w:type="dxa" w:w="1560"/>
+          </w:tcPr>
+          <w:p>
+            <w:r/>
+            <w:r>
+              <w:rPr>
+                <w:sz w:val="20"/>
+              </w:rPr>
+              <w:t>Profesional Ambiental / Estudiante de Maestría</w:t>
+            </w:r>
+          </w:p>
+        </w:tc>
+        <w:tc>
+          <w:tcPr>
+            <w:tcW w:type="dxa" w:w="1560"/>
+          </w:tcPr>
+          <w:p>
+            <w:r/>
+            <w:r>
+              <w:rPr>
+                <w:sz w:val="20"/>
+              </w:rPr>
+              <w:t>5 / 5</w:t>
+            </w:r>
+          </w:p>
+        </w:tc>
+        <w:tc>
+          <w:tcPr>
+            <w:tcW w:type="dxa" w:w="1560"/>
+          </w:tcPr>
+          <w:p>
+            <w:r/>
+            <w:r>
+              <w:rPr>
+                <w:sz w:val="20"/>
+              </w:rPr>
+              <w:t>3 / 5</w:t>
+            </w:r>
+          </w:p>
+        </w:tc>
+        <w:tc>
+          <w:tcPr>
+            <w:tcW w:type="dxa" w:w="1560"/>
+          </w:tcPr>
+          <w:p>
+            <w:r/>
+            <w:r>
+              <w:rPr>
+                <w:sz w:val="20"/>
+              </w:rPr>
+              <w:t>5 / 5</w:t>
+            </w:r>
+          </w:p>
+        </w:tc>
+        <w:tc>
+          <w:tcPr>
+            <w:tcW w:type="dxa" w:w="1560"/>
+          </w:tcPr>
+          <w:p>
+            <w:r/>
+            <w:r>
+              <w:rPr>
+                <w:sz w:val="20"/>
+              </w:rPr>
+              <w:t>5 / 5</w:t>
+            </w:r>
+          </w:p>
+        </w:tc>
+        <w:tc>
+          <w:tcPr>
+            <w:tcW w:type="dxa" w:w="1560"/>
+          </w:tcPr>
+          <w:p>
+            <w:r/>
+            <w:r>
+              <w:rPr>
+                <w:sz w:val="20"/>
+              </w:rPr>
+              <w:t>Ficha consolidada de metadatos, control de permisos por rol de dominio y registro de auditoría.</w:t>
+            </w:r>
+          </w:p>
+        </w:tc>
+      </w:tr>
+      <w:tr>
+        <w:tc>
+          <w:tcPr>
+            <w:tcW w:type="dxa" w:w="1560"/>
+          </w:tcPr>
+          <w:p>
+            <w:r/>
+            <w:r>
+              <w:rPr>
+                <w:sz w:val="20"/>
+              </w:rPr>
+              <w:t>Docente Investigador</w:t>
+            </w:r>
+          </w:p>
+        </w:tc>
+        <w:tc>
+          <w:tcPr>
+            <w:tcW w:type="dxa" w:w="1560"/>
+          </w:tcPr>
+          <w:p>
+            <w:r/>
+            <w:r>
+              <w:rPr>
+                <w:sz w:val="20"/>
+              </w:rPr>
+              <w:t>5 / 5</w:t>
+            </w:r>
+          </w:p>
+        </w:tc>
+        <w:tc>
+          <w:tcPr>
+            <w:tcW w:type="dxa" w:w="1560"/>
+          </w:tcPr>
+          <w:p>
+            <w:r/>
+            <w:r>
+              <w:rPr>
+                <w:sz w:val="20"/>
+              </w:rPr>
+              <w:t>3 / 5</w:t>
+            </w:r>
+          </w:p>
+        </w:tc>
+        <w:tc>
+          <w:tcPr>
+            <w:tcW w:type="dxa" w:w="1560"/>
+          </w:tcPr>
+          <w:p>
+            <w:r/>
+            <w:r>
+              <w:rPr>
+                <w:sz w:val="20"/>
+              </w:rPr>
+              <w:t>4 / 5</w:t>
+            </w:r>
+          </w:p>
+        </w:tc>
+        <w:tc>
+          <w:tcPr>
+            <w:tcW w:type="dxa" w:w="1560"/>
+          </w:tcPr>
+          <w:p>
+            <w:r/>
+            <w:r>
+              <w:rPr>
+                <w:sz w:val="20"/>
+              </w:rPr>
+              <w:t>5 / 5</w:t>
+            </w:r>
+          </w:p>
+        </w:tc>
+        <w:tc>
+          <w:tcPr>
+            <w:tcW w:type="dxa" w:w="1560"/>
+          </w:tcPr>
+          <w:p>
+            <w:r/>
+            <w:r>
+              <w:rPr>
+                <w:sz w:val="20"/>
+              </w:rPr>
+              <w:t>Acceso ágil a rutas de red, preservación de carpetas existentes y trazabilidad de modificaciones.</w:t>
+            </w:r>
+          </w:p>
+        </w:tc>
+      </w:tr>
+      <w:tr>
+        <w:tc>
+          <w:tcPr>
+            <w:tcW w:type="dxa" w:w="1560"/>
+          </w:tcPr>
+          <w:p>
+            <w:r/>
+            <w:r>
+              <w:rPr>
+                <w:b/>
+                <w:sz w:val="20"/>
+              </w:rPr>
+              <w:t>Promedio General</w:t>
+            </w:r>
+          </w:p>
+        </w:tc>
+        <w:tc>
+          <w:tcPr>
+            <w:tcW w:type="dxa" w:w="1560"/>
+          </w:tcPr>
+          <w:p>
+            <w:r/>
+            <w:r>
+              <w:rPr>
+                <w:b/>
+                <w:sz w:val="20"/>
+              </w:rPr>
+              <w:t>5,0 / 5,0</w:t>
+            </w:r>
+          </w:p>
+        </w:tc>
+        <w:tc>
+          <w:tcPr>
+            <w:tcW w:type="dxa" w:w="1560"/>
+          </w:tcPr>
+          <w:p>
+            <w:r/>
+            <w:r>
+              <w:rPr>
+                <w:b/>
+                <w:sz w:val="20"/>
+              </w:rPr>
+              <w:t>3,7 / 5,0</w:t>
+            </w:r>
+          </w:p>
+        </w:tc>
+        <w:tc>
+          <w:tcPr>
+            <w:tcW w:type="dxa" w:w="1560"/>
+          </w:tcPr>
+          <w:p>
+            <w:r/>
+            <w:r>
+              <w:rPr>
+                <w:b/>
+                <w:sz w:val="20"/>
+              </w:rPr>
+              <w:t>3,7 / 5,0</w:t>
+            </w:r>
+          </w:p>
+        </w:tc>
+        <w:tc>
+          <w:tcPr>
+            <w:tcW w:type="dxa" w:w="1560"/>
+          </w:tcPr>
+          <w:p>
+            <w:r/>
+            <w:r>
+              <w:rPr>
+                <w:b/>
+                <w:sz w:val="20"/>
+              </w:rPr>
+              <w:t>4,3 / 5,0</w:t>
+            </w:r>
+          </w:p>
+        </w:tc>
+        <w:tc>
+          <w:tcPr>
+            <w:tcW w:type="dxa" w:w="1560"/>
+          </w:tcPr>
+          <w:p>
+            <w:r/>
+            <w:r>
+              <w:rPr>
+                <w:b/>
+                <w:sz w:val="20"/>
+              </w:rPr>
+              <w:t>Consolidación integral en el cierre iterativo (Sprint 8).</w:t>
+            </w:r>
+          </w:p>
+        </w:tc>
+      </w:tr>
+    </w:tbl>
+    <w:p>
+      <w:r>
+        <w:rPr>
+          <w:i/>
+        </w:rPr>
+        <w:t xml:space="preserve">Nota. </w:t>
+      </w:r>
+      <w:r>
+        <w:t>Elaboración propia a partir de los registros del instrumento de validación operativa (Encuesta1.csv).</w:t>
       </w:r>
     </w:p>
     <w:sectPr>
@@ -11216,11 +11170,9 @@
       <w:jc w:val="right"/>
     </w:pPr>
     <w:r>
-      <w:t>CORNISA</w:t>
+      <w:t>SISTEMA GEOMÁTICA UIS</w:t>
     </w:r>
-    <w:r>
-      <w:t xml:space="preserve"> EN MAYÚSCULA Y MENOR A 50 CARACTERES</w:t>
-    </w:r>
+    <w:r/>
     <w:r>
       <w:tab/>
     </w:r>

</xml_diff>